<commit_message>
docs: add group members with rm to readme and full report
</commit_message>
<xml_diff>
--- a/docs/Regencia_CP5_Documentacao.docx
+++ b/docs/Regencia_CP5_Documentacao.docx
@@ -62,6 +62,58 @@
           <w:szCs w:val="22"/>
         </w:rPr>
         <w:t xml:space="preserve">NLP, Chatbots e Agentes Virtuais: FIAP</w:t>
+      </w:r>
+    </w:p>
+    <w:p>
+      <w:pPr>
+        <w:spacing w:after="40" w:before="500"/>
+        <w:jc w:val="center"/>
+      </w:pPr>
+      <w:r>
+        <w:rPr>
+          <w:b/>
+          <w:bCs/>
+          <w:sz w:val="22"/>
+          <w:szCs w:val="22"/>
+        </w:rPr>
+        <w:t xml:space="preserve">Integrantes do grupo:</w:t>
+      </w:r>
+    </w:p>
+    <w:p>
+      <w:pPr>
+        <w:jc w:val="center"/>
+      </w:pPr>
+      <w:r>
+        <w:rPr>
+          <w:sz w:val="22"/>
+          <w:szCs w:val="22"/>
+        </w:rPr>
+        <w:t xml:space="preserve">Arthur Baptista dos Santos, RM: 565346</w:t>
+      </w:r>
+    </w:p>
+    <w:p>
+      <w:pPr>
+        <w:jc w:val="center"/>
+      </w:pPr>
+      <w:r>
+        <w:rPr>
+          <w:sz w:val="22"/>
+          <w:szCs w:val="22"/>
+        </w:rPr>
+        <w:t xml:space="preserve">João Pedro de Moura Dutra Franco, RM: 561738</w:t>
+      </w:r>
+    </w:p>
+    <w:p>
+      <w:pPr>
+        <w:spacing w:after="400"/>
+        <w:jc w:val="center"/>
+      </w:pPr>
+      <w:r>
+        <w:rPr>
+          <w:sz w:val="22"/>
+          <w:szCs w:val="22"/>
+        </w:rPr>
+        <w:t xml:space="preserve">Nelson Félix Neto, RM: 565603</w:t>
       </w:r>
     </w:p>
     <w:p>

</xml_diff>

<commit_message>
feat(ai): add in-browser llm (webllm + webgpu) with local fallback and guaranteed timeout
</commit_message>
<xml_diff>
--- a/docs/Regencia_CP5_Documentacao.docx
+++ b/docs/Regencia_CP5_Documentacao.docx
@@ -190,7 +190,7 @@
         <w:spacing w:after="70"/>
       </w:pPr>
       <w:r>
-        <w:t xml:space="preserve">Versão online: a mesma pasta web/ pode ser publicada como site estático; a "IA ao vivo" depende do ambiente de publicação e, quando não estiver disponível, o jogo usa o interpretador local.</w:t>
+        <w:t xml:space="preserve">Versão online (GitHub Pages): site estático. Por padrão usa o interpretador local; o botão "Ativar IA no navegador" baixa um modelo de linguagem (Qwen2.5-1.5B-Instruct, cerca de 1 GB, uma vez) que roda no computador de quem joga via WebGPU, sem servidor e sem chave de API.</w:t>
       </w:r>
     </w:p>
     <w:p>
@@ -2271,7 +2271,22 @@
           <w:b/>
           <w:bCs/>
         </w:rPr>
-        <w:t xml:space="preserve">Como é chamado: </w:t>
+        <w:t xml:space="preserve">Opção pública (site no GitHub): </w:t>
+      </w:r>
+      <w:r>
+        <w:t xml:space="preserve">Botão "Ativar IA no navegador": biblioteca WebLLM (MLC AI) carrega o modelo Qwen2.5-1.5B-Instruct (Alibaba, quantizado em 4 bits, licença a conferir no cartão do modelo) e o executa localmente por WebGPU. A resposta é lida como JSON e passa por coagirDecreto() e validarDecreto(). Se o modelo errar ou demorar mais de 40 s, o decreto é refeito pelo interpretador local. Foi verificado que o modelo carrega e fica ativo pelo botão do jogo; a qualidade das respostas em português depende do modelo pequeno e deve ser avaliada pelo grupo.</w:t>
+      </w:r>
+    </w:p>
+    <w:p>
+      <w:pPr>
+        <w:spacing w:after="140" w:line="290"/>
+      </w:pPr>
+      <w:r>
+        <w:rPr>
+          <w:b/>
+          <w:bCs/>
+        </w:rPr>
+        <w:t xml:space="preserve">Opção do ambiente de publicação: </w:t>
       </w:r>
       <w:r>
         <w:t xml:space="preserve">Capacidade "sample" do ambiente de publicação: sample.json(prompt, { modelTier: "quick", cache: false, signal }). Roda na conta do espectador, que autoriza no primeiro decreto. Não há chave de API no código nem servidor.</w:t>

</xml_diff>

<commit_message>
docs: add presentation video link, extra points evidence and updated change log
</commit_message>
<xml_diff>
--- a/docs/Regencia_CP5_Documentacao.docx
+++ b/docs/Regencia_CP5_Documentacao.docx
@@ -3364,6 +3364,60 @@
         <w:spacing w:after="140" w:before="260"/>
       </w:pPr>
       <w:r>
+        <w:t xml:space="preserve">Prompt 6: a IA no jogo publicado</w:t>
+      </w:r>
+    </w:p>
+    <w:p>
+      <w:pPr>
+        <w:spacing w:after="140" w:line="290"/>
+      </w:pPr>
+      <w:r>
+        <w:rPr>
+          <w:b/>
+          <w:bCs/>
+        </w:rPr>
+        <w:t xml:space="preserve">Pedido: </w:t>
+      </w:r>
+      <w:r>
+        <w:t xml:space="preserve">"Mas e no jogo publicado? não tem llm? ou algo que faça o papel da ia? qual é a lógica disso"</w:t>
+      </w:r>
+    </w:p>
+    <w:p>
+      <w:pPr>
+        <w:spacing w:after="140" w:line="290"/>
+      </w:pPr>
+      <w:r>
+        <w:rPr>
+          <w:b/>
+          <w:bCs/>
+        </w:rPr>
+        <w:t xml:space="preserve">O que a IA gerou: </w:t>
+      </w:r>
+      <w:r>
+        <w:t xml:space="preserve">Explicou que o site estático usava só o interpretador local, testou um serviço público gratuito de texto (erro 500) e implementou o botão "Ativar IA no navegador", que carrega o Qwen2.5-1.5B-Instruct no navegador via WebLLM e WebGPU, com fallback para o interpretador local.</w:t>
+      </w:r>
+    </w:p>
+    <w:p>
+      <w:pPr>
+        <w:spacing w:after="140" w:line="290"/>
+      </w:pPr>
+      <w:r>
+        <w:rPr>
+          <w:b/>
+          <w:bCs/>
+        </w:rPr>
+        <w:t xml:space="preserve">Ajustes / rejeições: </w:t>
+      </w:r>
+      <w:r>
+        <w:t xml:space="preserve">O serviço público foi rejeitado por instável. O modo de JSON forçado falhou e foi trocado por JSON pedido no prompt. O tempo limite dependia de o modelo obedecer ao cancelamento e virou uma corrida com Promise.race. O navegador headless do teste não cria dispositivo WebGPU e o painel do app ficava oculto; por isso a qualidade das respostas do modelo ficou sem medição e está declarada como limitação.</w:t>
+      </w:r>
+    </w:p>
+    <w:p>
+      <w:pPr>
+        <w:pStyle w:val="Heading2"/>
+        <w:spacing w:after="140" w:before="260"/>
+      </w:pPr>
+      <w:r>
         <w:t xml:space="preserve">4.3 Explicação do funcionamento do código</w:t>
       </w:r>
     </w:p>
@@ -3798,7 +3852,7 @@
                 <w:sz w:val="18"/>
                 <w:szCs w:val="18"/>
               </w:rPr>
-              <w:t xml:space="preserve">Modelo de linguagem via sample.json (modelTier "quick") + interpretador local por palavras-chave. Ollama não foi implementado.</w:t>
+              <w:t xml:space="preserve">Duas opções: modelo de linguagem do ambiente de publicação (sample.json) e, no site do GitHub, o Qwen2.5-1.5B-Instruct rodando no navegador (WebLLM + WebGPU), ativado por botão. Interpretador local por palavras-chave como fallback. Ollama não foi implementado.</w:t>
             </w:r>
           </w:p>
         </w:tc>
@@ -3820,7 +3874,7 @@
                 <w:sz w:val="18"/>
                 <w:szCs w:val="18"/>
               </w:rPr>
-              <w:t xml:space="preserve">Consequência da linha anterior. O tier "quick" responde em ~1 a 2 s, compatível com jogo em tempo real. O interpretador local cumpre o papel do fallback gratuito/offline.</w:t>
+              <w:t xml:space="preserve">Um site estático não pode guardar chave de API sem expô-la. Foi testado antes um serviço público gratuito de texto, que respondeu erro 500 (servidor sem espaço em disco) e foi descartado por não ser confiável. O modelo no navegador não precisa de servidor nem de chave, ao custo de um download de cerca de 1 GB na primeira vez e de exigir WebGPU. Um modo de saída JSON forçado do WebLLM falhou ao inicializar; passamos a pedir JSON no prompt e a validar a resposta.</w:t>
             </w:r>
           </w:p>
         </w:tc>
@@ -6440,6 +6494,210 @@
                 <w:sz w:val="18"/>
                 <w:szCs w:val="18"/>
               </w:rPr>
+              <w:t xml:space="preserve">IA que erra: alvo inventado ou JSON fora do catálogo</w:t>
+            </w:r>
+          </w:p>
+        </w:tc>
+        <w:tc>
+          <w:tcPr>
+            <w:tcW w:type="dxa" w:w="2800"/>
+            <w:tcMar>
+              <w:top w:type="dxa" w:w="70"/>
+              <w:left w:type="dxa" w:w="90"/>
+              <w:bottom w:type="dxa" w:w="70"/>
+              <w:right w:type="dxa" w:w="90"/>
+            </w:tcMar>
+          </w:tcPr>
+          <w:p>
+            <w:r>
+              <w:rPr>
+                <w:b w:val="false"/>
+                <w:bCs w:val="false"/>
+                <w:sz w:val="18"/>
+                <w:szCs w:val="18"/>
+              </w:rPr>
+              <w:t xml:space="preserve">O decreto é refeito pelo interpretador local, sem recusar</w:t>
+            </w:r>
+          </w:p>
+        </w:tc>
+        <w:tc>
+          <w:tcPr>
+            <w:tcW w:type="dxa" w:w="4100"/>
+            <w:tcMar>
+              <w:top w:type="dxa" w:w="70"/>
+              <w:left w:type="dxa" w:w="90"/>
+              <w:bottom w:type="dxa" w:w="70"/>
+              <w:right w:type="dxa" w:w="90"/>
+            </w:tcMar>
+          </w:tcPr>
+          <w:p>
+            <w:r>
+              <w:rPr>
+                <w:b w:val="false"/>
+                <w:bCs w:val="false"/>
+                <w:sz w:val="18"/>
+                <w:szCs w:val="18"/>
+              </w:rPr>
+              <w:t xml:space="preserve">Aprovado com IA simulada: "local-fallback | aplicado"</w:t>
+            </w:r>
+          </w:p>
+        </w:tc>
+      </w:tr>
+      <w:tr>
+        <w:tc>
+          <w:tcPr>
+            <w:tcW w:type="dxa" w:w="2900"/>
+            <w:tcMar>
+              <w:top w:type="dxa" w:w="70"/>
+              <w:left w:type="dxa" w:w="90"/>
+              <w:bottom w:type="dxa" w:w="70"/>
+              <w:right w:type="dxa" w:w="90"/>
+            </w:tcMar>
+          </w:tcPr>
+          <w:p>
+            <w:r>
+              <w:rPr>
+                <w:b w:val="false"/>
+                <w:bCs w:val="false"/>
+                <w:sz w:val="18"/>
+                <w:szCs w:val="18"/>
+              </w:rPr>
+              <w:t xml:space="preserve">IA que trava</w:t>
+            </w:r>
+          </w:p>
+        </w:tc>
+        <w:tc>
+          <w:tcPr>
+            <w:tcW w:type="dxa" w:w="2800"/>
+            <w:tcMar>
+              <w:top w:type="dxa" w:w="70"/>
+              <w:left w:type="dxa" w:w="90"/>
+              <w:bottom w:type="dxa" w:w="70"/>
+              <w:right w:type="dxa" w:w="90"/>
+            </w:tcMar>
+          </w:tcPr>
+          <w:p>
+            <w:r>
+              <w:rPr>
+                <w:b w:val="false"/>
+                <w:bCs w:val="false"/>
+                <w:sz w:val="18"/>
+                <w:szCs w:val="18"/>
+              </w:rPr>
+              <w:t xml:space="preserve">O jogo continua e o tempo limite é respeitado</w:t>
+            </w:r>
+          </w:p>
+        </w:tc>
+        <w:tc>
+          <w:tcPr>
+            <w:tcW w:type="dxa" w:w="4100"/>
+            <w:tcMar>
+              <w:top w:type="dxa" w:w="70"/>
+              <w:left w:type="dxa" w:w="90"/>
+              <w:bottom w:type="dxa" w:w="70"/>
+              <w:right w:type="dxa" w:w="90"/>
+            </w:tcMar>
+          </w:tcPr>
+          <w:p>
+            <w:r>
+              <w:rPr>
+                <w:b w:val="false"/>
+                <w:bCs w:val="false"/>
+                <w:sz w:val="18"/>
+                <w:szCs w:val="18"/>
+              </w:rPr>
+              <w:t xml:space="preserve">Aprovado com IA simulada que nunca responde: o jogo não prende a espera</w:t>
+            </w:r>
+          </w:p>
+        </w:tc>
+      </w:tr>
+      <w:tr>
+        <w:tc>
+          <w:tcPr>
+            <w:tcW w:type="dxa" w:w="2900"/>
+            <w:tcMar>
+              <w:top w:type="dxa" w:w="70"/>
+              <w:left w:type="dxa" w:w="90"/>
+              <w:bottom w:type="dxa" w:w="70"/>
+              <w:right w:type="dxa" w:w="90"/>
+            </w:tcMar>
+          </w:tcPr>
+          <w:p>
+            <w:r>
+              <w:rPr>
+                <w:b w:val="false"/>
+                <w:bCs w:val="false"/>
+                <w:sz w:val="18"/>
+                <w:szCs w:val="18"/>
+              </w:rPr>
+              <w:t xml:space="preserve">Ativação do modelo no navegador (botão do menu)</w:t>
+            </w:r>
+          </w:p>
+        </w:tc>
+        <w:tc>
+          <w:tcPr>
+            <w:tcW w:type="dxa" w:w="2800"/>
+            <w:tcMar>
+              <w:top w:type="dxa" w:w="70"/>
+              <w:left w:type="dxa" w:w="90"/>
+              <w:bottom w:type="dxa" w:w="70"/>
+              <w:right w:type="dxa" w:w="90"/>
+            </w:tcMar>
+          </w:tcPr>
+          <w:p>
+            <w:r>
+              <w:rPr>
+                <w:b w:val="false"/>
+                <w:bCs w:val="false"/>
+                <w:sz w:val="18"/>
+                <w:szCs w:val="18"/>
+              </w:rPr>
+              <w:t xml:space="preserve">Baixa o modelo, carrega na GPU e mostra "IA ao vivo: ligada"</w:t>
+            </w:r>
+          </w:p>
+        </w:tc>
+        <w:tc>
+          <w:tcPr>
+            <w:tcW w:type="dxa" w:w="4100"/>
+            <w:tcMar>
+              <w:top w:type="dxa" w:w="70"/>
+              <w:left w:type="dxa" w:w="90"/>
+              <w:bottom w:type="dxa" w:w="70"/>
+              <w:right w:type="dxa" w:w="90"/>
+            </w:tcMar>
+          </w:tcPr>
+          <w:p>
+            <w:r>
+              <w:rPr>
+                <w:b w:val="false"/>
+                <w:bCs w:val="false"/>
+                <w:sz w:val="18"/>
+                <w:szCs w:val="18"/>
+              </w:rPr>
+              <w:t xml:space="preserve">Aprovado no navegador do ambiente de desenvolvimento (Intel Gen12, WebGPU); qualidade das respostas não medida</w:t>
+            </w:r>
+          </w:p>
+        </w:tc>
+      </w:tr>
+      <w:tr>
+        <w:tc>
+          <w:tcPr>
+            <w:tcW w:type="dxa" w:w="2900"/>
+            <w:tcMar>
+              <w:top w:type="dxa" w:w="70"/>
+              <w:left w:type="dxa" w:w="90"/>
+              <w:bottom w:type="dxa" w:w="70"/>
+              <w:right w:type="dxa" w:w="90"/>
+            </w:tcMar>
+          </w:tcPr>
+          <w:p>
+            <w:r>
+              <w:rPr>
+                <w:b w:val="false"/>
+                <w:bCs w:val="false"/>
+                <w:sz w:val="18"/>
+                <w:szCs w:val="18"/>
+              </w:rPr>
               <w:t xml:space="preserve">Regente-IA</w:t>
             </w:r>
           </w:p>
@@ -6768,7 +7026,7 @@
         <w:spacing w:after="180" w:before="360"/>
       </w:pPr>
       <w:r>
-        <w:t xml:space="preserve">7. Vídeo de demonstração</w:t>
+        <w:t xml:space="preserve">7. Pontos extras da rubrica (seção 6.2 do enunciado)</w:t>
       </w:r>
     </w:p>
     <w:p>
@@ -6776,16 +7034,495 @@
         <w:spacing w:after="140" w:line="290"/>
       </w:pPr>
       <w:r>
-        <w:t xml:space="preserve">O vídeo de demonstração (2 a 5 minutos) é entregue junto com este documento, como arquivo ou link.</w:t>
-      </w:r>
-    </w:p>
+        <w:t xml:space="preserve">Cada item abaixo indica onde está a evidência (no jogo publicado, no código ou no vídeo).</w:t>
+      </w:r>
+    </w:p>
+    <w:tbl>
+      <w:tblPr>
+        <w:tblW w:type="dxa" w:w="9800"/>
+        <w:tblBorders>
+          <w:top w:val="single" w:color="auto" w:sz="4"/>
+          <w:left w:val="single" w:color="auto" w:sz="4"/>
+          <w:bottom w:val="single" w:color="auto" w:sz="4"/>
+          <w:right w:val="single" w:color="auto" w:sz="4"/>
+          <w:insideH w:val="single" w:color="auto" w:sz="4"/>
+          <w:insideV w:val="single" w:color="auto" w:sz="4"/>
+        </w:tblBorders>
+      </w:tblPr>
+      <w:tblGrid>
+        <w:gridCol w:w="2900"/>
+        <w:gridCol w:w="1300"/>
+        <w:gridCol w:w="5600"/>
+      </w:tblGrid>
+      <w:tr>
+        <w:trPr>
+          <w:tblHeader/>
+        </w:trPr>
+        <w:tc>
+          <w:tcPr>
+            <w:tcW w:type="dxa" w:w="2900"/>
+            <w:shd w:fill="E4E1EC" w:val="clear"/>
+            <w:tcMar>
+              <w:top w:type="dxa" w:w="70"/>
+              <w:left w:type="dxa" w:w="90"/>
+              <w:bottom w:type="dxa" w:w="70"/>
+              <w:right w:type="dxa" w:w="90"/>
+            </w:tcMar>
+          </w:tcPr>
+          <w:p>
+            <w:r>
+              <w:rPr>
+                <w:b/>
+                <w:bCs/>
+                <w:sz w:val="18"/>
+                <w:szCs w:val="18"/>
+              </w:rPr>
+              <w:t xml:space="preserve">Item da rubrica</w:t>
+            </w:r>
+          </w:p>
+        </w:tc>
+        <w:tc>
+          <w:tcPr>
+            <w:tcW w:type="dxa" w:w="1300"/>
+            <w:shd w:fill="E4E1EC" w:val="clear"/>
+            <w:tcMar>
+              <w:top w:type="dxa" w:w="70"/>
+              <w:left w:type="dxa" w:w="90"/>
+              <w:bottom w:type="dxa" w:w="70"/>
+              <w:right w:type="dxa" w:w="90"/>
+            </w:tcMar>
+          </w:tcPr>
+          <w:p>
+            <w:r>
+              <w:rPr>
+                <w:b/>
+                <w:bCs/>
+                <w:sz w:val="18"/>
+                <w:szCs w:val="18"/>
+              </w:rPr>
+              <w:t xml:space="preserve">Atendido</w:t>
+            </w:r>
+          </w:p>
+        </w:tc>
+        <w:tc>
+          <w:tcPr>
+            <w:tcW w:type="dxa" w:w="5600"/>
+            <w:shd w:fill="E4E1EC" w:val="clear"/>
+            <w:tcMar>
+              <w:top w:type="dxa" w:w="70"/>
+              <w:left w:type="dxa" w:w="90"/>
+              <w:bottom w:type="dxa" w:w="70"/>
+              <w:right w:type="dxa" w:w="90"/>
+            </w:tcMar>
+          </w:tcPr>
+          <w:p>
+            <w:r>
+              <w:rPr>
+                <w:b/>
+                <w:bCs/>
+                <w:sz w:val="18"/>
+                <w:szCs w:val="18"/>
+              </w:rPr>
+              <w:t xml:space="preserve">Evidência</w:t>
+            </w:r>
+          </w:p>
+        </w:tc>
+      </w:tr>
+      <w:tr>
+        <w:tc>
+          <w:tcPr>
+            <w:tcW w:type="dxa" w:w="2900"/>
+            <w:tcMar>
+              <w:top w:type="dxa" w:w="70"/>
+              <w:left w:type="dxa" w:w="90"/>
+              <w:bottom w:type="dxa" w:w="70"/>
+              <w:right w:type="dxa" w:w="90"/>
+            </w:tcMar>
+          </w:tcPr>
+          <w:p>
+            <w:r>
+              <w:rPr>
+                <w:b w:val="false"/>
+                <w:bCs w:val="false"/>
+                <w:sz w:val="18"/>
+                <w:szCs w:val="18"/>
+              </w:rPr>
+              <w:t xml:space="preserve">MVP publicado e acessível publicamente, sem setup local</w:t>
+            </w:r>
+          </w:p>
+        </w:tc>
+        <w:tc>
+          <w:tcPr>
+            <w:tcW w:type="dxa" w:w="1300"/>
+            <w:tcMar>
+              <w:top w:type="dxa" w:w="70"/>
+              <w:left w:type="dxa" w:w="90"/>
+              <w:bottom w:type="dxa" w:w="70"/>
+              <w:right w:type="dxa" w:w="90"/>
+            </w:tcMar>
+          </w:tcPr>
+          <w:p>
+            <w:r>
+              <w:rPr>
+                <w:b w:val="false"/>
+                <w:bCs w:val="false"/>
+                <w:sz w:val="18"/>
+                <w:szCs w:val="18"/>
+              </w:rPr>
+              <w:t xml:space="preserve">Sim</w:t>
+            </w:r>
+          </w:p>
+        </w:tc>
+        <w:tc>
+          <w:tcPr>
+            <w:tcW w:type="dxa" w:w="5600"/>
+            <w:tcMar>
+              <w:top w:type="dxa" w:w="70"/>
+              <w:left w:type="dxa" w:w="90"/>
+              <w:bottom w:type="dxa" w:w="70"/>
+              <w:right w:type="dxa" w:w="90"/>
+            </w:tcMar>
+          </w:tcPr>
+          <w:p>
+            <w:r>
+              <w:rPr>
+                <w:b w:val="false"/>
+                <w:bCs w:val="false"/>
+                <w:sz w:val="18"/>
+                <w:szCs w:val="18"/>
+              </w:rPr>
+              <w:t xml:space="preserve">Jogo no ar em https://arthur-baptista-dos-santos.github.io/REGENCIA/ (GitHub Pages, com deploy automático a cada atualização do repositório). Abre no navegador, sem instalar nada.</w:t>
+            </w:r>
+          </w:p>
+        </w:tc>
+      </w:tr>
+      <w:tr>
+        <w:tc>
+          <w:tcPr>
+            <w:tcW w:type="dxa" w:w="2900"/>
+            <w:tcMar>
+              <w:top w:type="dxa" w:w="70"/>
+              <w:left w:type="dxa" w:w="90"/>
+              <w:bottom w:type="dxa" w:w="70"/>
+              <w:right w:type="dxa" w:w="90"/>
+            </w:tcMar>
+          </w:tcPr>
+          <w:p>
+            <w:r>
+              <w:rPr>
+                <w:b w:val="false"/>
+                <w:bCs w:val="false"/>
+                <w:sz w:val="18"/>
+                <w:szCs w:val="18"/>
+              </w:rPr>
+              <w:t xml:space="preserve">Integração real de 2 ou mais modalidades de IA generativa</w:t>
+            </w:r>
+          </w:p>
+        </w:tc>
+        <w:tc>
+          <w:tcPr>
+            <w:tcW w:type="dxa" w:w="1300"/>
+            <w:tcMar>
+              <w:top w:type="dxa" w:w="70"/>
+              <w:left w:type="dxa" w:w="90"/>
+              <w:bottom w:type="dxa" w:w="70"/>
+              <w:right w:type="dxa" w:w="90"/>
+            </w:tcMar>
+          </w:tcPr>
+          <w:p>
+            <w:r>
+              <w:rPr>
+                <w:b w:val="false"/>
+                <w:bCs w:val="false"/>
+                <w:sz w:val="18"/>
+                <w:szCs w:val="18"/>
+              </w:rPr>
+              <w:t xml:space="preserve">Sim, com ressalva</w:t>
+            </w:r>
+          </w:p>
+        </w:tc>
+        <w:tc>
+          <w:tcPr>
+            <w:tcW w:type="dxa" w:w="5600"/>
+            <w:tcMar>
+              <w:top w:type="dxa" w:w="70"/>
+              <w:left w:type="dxa" w:w="90"/>
+              <w:bottom w:type="dxa" w:w="70"/>
+              <w:right w:type="dxa" w:w="90"/>
+            </w:tcMar>
+          </w:tcPr>
+          <w:p>
+            <w:r>
+              <w:rPr>
+                <w:b w:val="false"/>
+                <w:bCs w:val="false"/>
+                <w:sz w:val="18"/>
+                <w:szCs w:val="18"/>
+              </w:rPr>
+              <w:t xml:space="preserve">Imagem: as artes geradas por IA (Bing Image Creator) são o fundo do menu e do gameplay, carregadas pelo jogo em execução. Texto: um modelo de linguagem (Qwen2.5-1.5B-Instruct) roda no navegador de quem joga pelo botão "Ativar IA no navegador" e interpreta os decretos; nesta versão do jogo a ativação do modelo foi verificada, mas a qualidade das respostas em português não foi medida (ver seção 3.1). Sem o modelo ativo, os decretos são interpretados por regras de palavras-chave.</w:t>
+            </w:r>
+          </w:p>
+        </w:tc>
+      </w:tr>
+      <w:tr>
+        <w:tc>
+          <w:tcPr>
+            <w:tcW w:type="dxa" w:w="2900"/>
+            <w:tcMar>
+              <w:top w:type="dxa" w:w="70"/>
+              <w:left w:type="dxa" w:w="90"/>
+              <w:bottom w:type="dxa" w:w="70"/>
+              <w:right w:type="dxa" w:w="90"/>
+            </w:tcMar>
+          </w:tcPr>
+          <w:p>
+            <w:r>
+              <w:rPr>
+                <w:b w:val="false"/>
+                <w:bCs w:val="false"/>
+                <w:sz w:val="18"/>
+                <w:szCs w:val="18"/>
+              </w:rPr>
+              <w:t xml:space="preserve">Mecânicas adicionais além das 3 mínimas</w:t>
+            </w:r>
+          </w:p>
+        </w:tc>
+        <w:tc>
+          <w:tcPr>
+            <w:tcW w:type="dxa" w:w="1300"/>
+            <w:tcMar>
+              <w:top w:type="dxa" w:w="70"/>
+              <w:left w:type="dxa" w:w="90"/>
+              <w:bottom w:type="dxa" w:w="70"/>
+              <w:right w:type="dxa" w:w="90"/>
+            </w:tcMar>
+          </w:tcPr>
+          <w:p>
+            <w:r>
+              <w:rPr>
+                <w:b w:val="false"/>
+                <w:bCs w:val="false"/>
+                <w:sz w:val="18"/>
+                <w:szCs w:val="18"/>
+              </w:rPr>
+              <w:t xml:space="preserve">Sim</w:t>
+            </w:r>
+          </w:p>
+        </w:tc>
+        <w:tc>
+          <w:tcPr>
+            <w:tcW w:type="dxa" w:w="5600"/>
+            <w:tcMar>
+              <w:top w:type="dxa" w:w="70"/>
+              <w:left w:type="dxa" w:w="90"/>
+              <w:bottom w:type="dxa" w:w="70"/>
+              <w:right w:type="dxa" w:w="90"/>
+            </w:tcMar>
+          </w:tcPr>
+          <w:p>
+            <w:r>
+              <w:rPr>
+                <w:b w:val="false"/>
+                <w:bCs w:val="false"/>
+                <w:sz w:val="18"/>
+                <w:szCs w:val="18"/>
+              </w:rPr>
+              <w:t xml:space="preserve">Além do movimento do Explorador, dos decretos e da Vontade: troca de papéis, bot Explorador com planejador de caminho, Regente-IA, materiais (lava, gelo, vidro, espelho), clima (chuva ácida, vento, neblina), obstáculos e slimes que podem ser pisados, marcos de renascimento, três níveis, co-op local e modo treino.</w:t>
+            </w:r>
+          </w:p>
+        </w:tc>
+      </w:tr>
+      <w:tr>
+        <w:tc>
+          <w:tcPr>
+            <w:tcW w:type="dxa" w:w="2900"/>
+            <w:tcMar>
+              <w:top w:type="dxa" w:w="70"/>
+              <w:left w:type="dxa" w:w="90"/>
+              <w:bottom w:type="dxa" w:w="70"/>
+              <w:right w:type="dxa" w:w="90"/>
+            </w:tcMar>
+          </w:tcPr>
+          <w:p>
+            <w:r>
+              <w:rPr>
+                <w:b w:val="false"/>
+                <w:bCs w:val="false"/>
+                <w:sz w:val="18"/>
+                <w:szCs w:val="18"/>
+              </w:rPr>
+              <w:t xml:space="preserve">Testes automatizados cobrindo as mecânicas centrais</w:t>
+            </w:r>
+          </w:p>
+        </w:tc>
+        <w:tc>
+          <w:tcPr>
+            <w:tcW w:type="dxa" w:w="1300"/>
+            <w:tcMar>
+              <w:top w:type="dxa" w:w="70"/>
+              <w:left w:type="dxa" w:w="90"/>
+              <w:bottom w:type="dxa" w:w="70"/>
+              <w:right w:type="dxa" w:w="90"/>
+            </w:tcMar>
+          </w:tcPr>
+          <w:p>
+            <w:r>
+              <w:rPr>
+                <w:b w:val="false"/>
+                <w:bCs w:val="false"/>
+                <w:sz w:val="18"/>
+                <w:szCs w:val="18"/>
+              </w:rPr>
+              <w:t xml:space="preserve">Sim</w:t>
+            </w:r>
+          </w:p>
+        </w:tc>
+        <w:tc>
+          <w:tcPr>
+            <w:tcW w:type="dxa" w:w="5600"/>
+            <w:tcMar>
+              <w:top w:type="dxa" w:w="70"/>
+              <w:left w:type="dxa" w:w="90"/>
+              <w:bottom w:type="dxa" w:w="70"/>
+              <w:right w:type="dxa" w:w="90"/>
+            </w:tcMar>
+          </w:tcPr>
+          <w:p>
+            <w:r>
+              <w:rPr>
+                <w:b w:val="false"/>
+                <w:bCs w:val="false"/>
+                <w:sz w:val="18"/>
+                <w:szCs w:val="18"/>
+              </w:rPr>
+              <w:t xml:space="preserve">23 testes em Node (níveis completáveis, validador, interpretador, efeitos, injeção de prompt) executados também no GitHub Actions antes de cada deploy, e 12 testes em Python do protótipo da CP4.</w:t>
+            </w:r>
+          </w:p>
+        </w:tc>
+      </w:tr>
+      <w:tr>
+        <w:tc>
+          <w:tcPr>
+            <w:tcW w:type="dxa" w:w="2900"/>
+            <w:tcMar>
+              <w:top w:type="dxa" w:w="70"/>
+              <w:left w:type="dxa" w:w="90"/>
+              <w:bottom w:type="dxa" w:w="70"/>
+              <w:right w:type="dxa" w:w="90"/>
+            </w:tcMar>
+          </w:tcPr>
+          <w:p>
+            <w:r>
+              <w:rPr>
+                <w:b w:val="false"/>
+                <w:bCs w:val="false"/>
+                <w:sz w:val="18"/>
+                <w:szCs w:val="18"/>
+              </w:rPr>
+              <w:t xml:space="preserve">Polimento da experiência e tratamento de erros da IA</w:t>
+            </w:r>
+          </w:p>
+        </w:tc>
+        <w:tc>
+          <w:tcPr>
+            <w:tcW w:type="dxa" w:w="1300"/>
+            <w:tcMar>
+              <w:top w:type="dxa" w:w="70"/>
+              <w:left w:type="dxa" w:w="90"/>
+              <w:bottom w:type="dxa" w:w="70"/>
+              <w:right w:type="dxa" w:w="90"/>
+            </w:tcMar>
+          </w:tcPr>
+          <w:p>
+            <w:r>
+              <w:rPr>
+                <w:b w:val="false"/>
+                <w:bCs w:val="false"/>
+                <w:sz w:val="18"/>
+                <w:szCs w:val="18"/>
+              </w:rPr>
+              <w:t xml:space="preserve">Sim</w:t>
+            </w:r>
+          </w:p>
+        </w:tc>
+        <w:tc>
+          <w:tcPr>
+            <w:tcW w:type="dxa" w:w="5600"/>
+            <w:tcMar>
+              <w:top w:type="dxa" w:w="70"/>
+              <w:left w:type="dxa" w:w="90"/>
+              <w:bottom w:type="dxa" w:w="70"/>
+              <w:right w:type="dxa" w:w="90"/>
+            </w:tcMar>
+          </w:tcPr>
+          <w:p>
+            <w:r>
+              <w:rPr>
+                <w:b w:val="false"/>
+                <w:bCs w:val="false"/>
+                <w:sz w:val="18"/>
+                <w:szCs w:val="18"/>
+              </w:rPr>
+              <w:t xml:space="preserve">Fallback automático para o interpretador local quando a IA está indisponível, demora mais de 15 a 40 segundos, devolve JSON inválido ou inventa um alvo; aviso na tela explicando o que aconteceu; tremor de câmera, partículas e efeitos sonoros procedurais; pausa, legenda ao vivo e indicador "interpretando decreto".</w:t>
+            </w:r>
+          </w:p>
+        </w:tc>
+      </w:tr>
+    </w:tbl>
     <w:p>
       <w:pPr>
         <w:pStyle w:val="Heading1"/>
         <w:spacing w:after="180" w:before="360"/>
       </w:pPr>
       <w:r>
-        <w:t xml:space="preserve">8. Segurança e análise de prompt injection</w:t>
+        <w:t xml:space="preserve">8. Vídeo de demonstração</w:t>
+      </w:r>
+    </w:p>
+    <w:p>
+      <w:pPr>
+        <w:spacing w:after="140" w:line="290"/>
+      </w:pPr>
+      <w:r>
+        <w:rPr>
+          <w:b/>
+          <w:bCs/>
+        </w:rPr>
+        <w:t xml:space="preserve">Título: </w:t>
+      </w:r>
+      <w:r>
+        <w:t xml:space="preserve">Regência - Front, NLP e GEN AI</w:t>
+      </w:r>
+    </w:p>
+    <w:p>
+      <w:pPr>
+        <w:spacing w:after="140" w:line="290"/>
+      </w:pPr>
+      <w:r>
+        <w:rPr>
+          <w:b/>
+          <w:bCs/>
+        </w:rPr>
+        <w:t xml:space="preserve">Link: </w:t>
+      </w:r>
+      <w:r>
+        <w:t xml:space="preserve">https://youtu.be/s1Bj-OcbRlQ</w:t>
+      </w:r>
+    </w:p>
+    <w:p>
+      <w:pPr>
+        <w:spacing w:after="140" w:line="290"/>
+      </w:pPr>
+      <w:r>
+        <w:t xml:space="preserve">O vídeo mostra o MVP em execução: tela de menu, jogabilidade das mecânicas e o conteúdo gerado por IA generativa dentro do jogo. O mesmo link está no arquivo link_video.txt da pasta de entrega e no README do repositório.</w:t>
+      </w:r>
+    </w:p>
+    <w:p>
+      <w:pPr>
+        <w:pStyle w:val="Heading1"/>
+        <w:spacing w:after="180" w:before="360"/>
+      </w:pPr>
+      <w:r>
+        <w:t xml:space="preserve">9. Segurança e análise de prompt injection</w:t>
       </w:r>
     </w:p>
     <w:p>
@@ -6854,7 +7591,7 @@
         <w:spacing w:after="180" w:before="360"/>
       </w:pPr>
       <w:r>
-        <w:t xml:space="preserve">9. Limitações conhecidas e próximos passos</w:t>
+        <w:t xml:space="preserve">10. Limitações conhecidas e próximos passos</w:t>
       </w:r>
     </w:p>
     <w:p>
@@ -6941,7 +7678,7 @@
         <w:spacing w:after="180" w:before="360"/>
       </w:pPr>
       <w:r>
-        <w:t xml:space="preserve">10. Referências</w:t>
+        <w:t xml:space="preserve">11. Referências</w:t>
       </w:r>
     </w:p>
     <w:p>

</xml_diff>